<commit_message>
Update BIPV manual generation script and document assets
Replit-Commit-Author: Agent
</commit_message>
<xml_diff>
--- a/attached_assets/MANUAL_OPERACION_BIPV_v2026_FASE4.docx
+++ b/attached_assets/MANUAL_OPERACION_BIPV_v2026_FASE4.docx
@@ -1821,6 +1821,434 @@
         <w:spacing w:after="60"/>
       </w:pPr>
     </w:p>
+    <w:p/>
+    <w:p>
+      <w:pPr>
+        <w:spacing w:before="200" w:after="80"/>
+        <w:jc w:val="left"/>
+      </w:pPr>
+      <w:r>
+        <w:rPr>
+          <w:b/>
+          <w:color w:val="0D47A1"/>
+          <w:sz w:val="22"/>
+        </w:rPr>
+        <w:t>📍 Coordenadas exactas del predio (opcional — para mayor precisión)</w:t>
+      </w:r>
+    </w:p>
+    <w:p>
+      <w:pPr>
+        <w:spacing w:before="20" w:after="40"/>
+        <w:ind w:left="170"/>
+      </w:pPr>
+      <w:r>
+        <w:rPr>
+          <w:b w:val="0"/>
+          <w:i w:val="0"/>
+          <w:sz w:val="18"/>
+        </w:rPr>
+        <w:t>Dentro de la columna 'Datos del sitio' aparece un expander "📍 Coordenadas exactas del predio". Ábralo si el predio tiene una ubicación GPS diferente al centro de la ciudad seleccionada. PVGIS descargará el TMY para ese punto exacto, y Vista 3D centrará el mapa y calculará el diagrama solar para esa latitud/longitud.</w:t>
+      </w:r>
+    </w:p>
+    <w:tbl>
+      <w:tblPr>
+        <w:tblStyle w:val="TableGrid"/>
+        <w:tblW w:type="auto" w:w="0"/>
+        <w:jc w:val="left"/>
+        <w:tblLook w:firstColumn="1" w:firstRow="1" w:lastColumn="0" w:lastRow="0" w:noHBand="0" w:noVBand="1" w:val="04A0"/>
+      </w:tblPr>
+      <w:tblGrid>
+        <w:gridCol w:w="3230"/>
+        <w:gridCol w:w="3230"/>
+        <w:gridCol w:w="3230"/>
+      </w:tblGrid>
+      <w:tr>
+        <w:tc>
+          <w:tcPr>
+            <w:tcW w:type="dxa" w:w="1984"/>
+            <w:shd w:val="clear" w:color="auto" w:fill="1B5E20"/>
+            <w:tcBorders>
+              <w:top w:val="single" w:sz="4" w:space="0" w:color="CCCCCC"/>
+              <w:left w:val="single" w:sz="4" w:space="0" w:color="CCCCCC"/>
+              <w:bottom w:val="single" w:sz="4" w:space="0" w:color="CCCCCC"/>
+              <w:right w:val="single" w:sz="4" w:space="0" w:color="CCCCCC"/>
+            </w:tcBorders>
+            <w:vAlign w:val="center"/>
+          </w:tcPr>
+          <w:p>
+            <w:pPr>
+              <w:jc w:val="center"/>
+            </w:pPr>
+            <w:r>
+              <w:rPr>
+                <w:b/>
+                <w:color w:val="FFFFFF"/>
+                <w:sz w:val="16"/>
+              </w:rPr>
+              <w:t>Campo</w:t>
+            </w:r>
+          </w:p>
+        </w:tc>
+        <w:tc>
+          <w:tcPr>
+            <w:tcW w:type="dxa" w:w="3969"/>
+            <w:shd w:val="clear" w:color="auto" w:fill="1B5E20"/>
+            <w:tcBorders>
+              <w:top w:val="single" w:sz="4" w:space="0" w:color="CCCCCC"/>
+              <w:left w:val="single" w:sz="4" w:space="0" w:color="CCCCCC"/>
+              <w:bottom w:val="single" w:sz="4" w:space="0" w:color="CCCCCC"/>
+              <w:right w:val="single" w:sz="4" w:space="0" w:color="CCCCCC"/>
+            </w:tcBorders>
+            <w:vAlign w:val="center"/>
+          </w:tcPr>
+          <w:p>
+            <w:pPr>
+              <w:jc w:val="center"/>
+            </w:pPr>
+            <w:r>
+              <w:rPr>
+                <w:b/>
+                <w:color w:val="FFFFFF"/>
+                <w:sz w:val="16"/>
+              </w:rPr>
+              <w:t>Descripción</w:t>
+            </w:r>
+          </w:p>
+        </w:tc>
+        <w:tc>
+          <w:tcPr>
+            <w:tcW w:type="dxa" w:w="4365"/>
+            <w:shd w:val="clear" w:color="auto" w:fill="1B5E20"/>
+            <w:tcBorders>
+              <w:top w:val="single" w:sz="4" w:space="0" w:color="CCCCCC"/>
+              <w:left w:val="single" w:sz="4" w:space="0" w:color="CCCCCC"/>
+              <w:bottom w:val="single" w:sz="4" w:space="0" w:color="CCCCCC"/>
+              <w:right w:val="single" w:sz="4" w:space="0" w:color="CCCCCC"/>
+            </w:tcBorders>
+            <w:vAlign w:val="center"/>
+          </w:tcPr>
+          <w:p>
+            <w:pPr>
+              <w:jc w:val="center"/>
+            </w:pPr>
+            <w:r>
+              <w:rPr>
+                <w:b/>
+                <w:color w:val="FFFFFF"/>
+                <w:sz w:val="16"/>
+              </w:rPr>
+              <w:t>Ejemplo proyecto Cra. 16 No. 33A-21, Bogotá</w:t>
+            </w:r>
+          </w:p>
+        </w:tc>
+      </w:tr>
+      <w:tr>
+        <w:tc>
+          <w:tcPr>
+            <w:tcW w:type="dxa" w:w="3230"/>
+            <w:shd w:val="clear" w:color="auto" w:fill="E8F5E9"/>
+            <w:tcBorders>
+              <w:top w:val="single" w:sz="4" w:space="0" w:color="CCCCCC"/>
+              <w:left w:val="single" w:sz="4" w:space="0" w:color="CCCCCC"/>
+              <w:bottom w:val="single" w:sz="4" w:space="0" w:color="CCCCCC"/>
+              <w:right w:val="single" w:sz="4" w:space="0" w:color="CCCCCC"/>
+            </w:tcBorders>
+          </w:tcPr>
+          <w:p>
+            <w:r>
+              <w:rPr>
+                <w:color w:val="37474F"/>
+                <w:sz w:val="16"/>
+              </w:rPr>
+              <w:t>Latitud (°N)</w:t>
+            </w:r>
+          </w:p>
+        </w:tc>
+        <w:tc>
+          <w:tcPr>
+            <w:tcW w:type="dxa" w:w="3230"/>
+            <w:shd w:val="clear" w:color="auto" w:fill="E8F5E9"/>
+            <w:tcBorders>
+              <w:top w:val="single" w:sz="4" w:space="0" w:color="CCCCCC"/>
+              <w:left w:val="single" w:sz="4" w:space="0" w:color="CCCCCC"/>
+              <w:bottom w:val="single" w:sz="4" w:space="0" w:color="CCCCCC"/>
+              <w:right w:val="single" w:sz="4" w:space="0" w:color="CCCCCC"/>
+            </w:tcBorders>
+          </w:tcPr>
+          <w:p>
+            <w:r>
+              <w:rPr>
+                <w:color w:val="37474F"/>
+                <w:sz w:val="16"/>
+              </w:rPr>
+              <w:t>Positivo = Norte del Ecuador. Colombia: 4° a 13°N.</w:t>
+            </w:r>
+          </w:p>
+        </w:tc>
+        <w:tc>
+          <w:tcPr>
+            <w:tcW w:type="dxa" w:w="3230"/>
+            <w:shd w:val="clear" w:color="auto" w:fill="E8F5E9"/>
+            <w:tcBorders>
+              <w:top w:val="single" w:sz="4" w:space="0" w:color="CCCCCC"/>
+              <w:left w:val="single" w:sz="4" w:space="0" w:color="CCCCCC"/>
+              <w:bottom w:val="single" w:sz="4" w:space="0" w:color="CCCCCC"/>
+              <w:right w:val="single" w:sz="4" w:space="0" w:color="CCCCCC"/>
+            </w:tcBorders>
+          </w:tcPr>
+          <w:p>
+            <w:r>
+              <w:rPr>
+                <w:color w:val="37474F"/>
+                <w:sz w:val="16"/>
+              </w:rPr>
+              <w:t>4.62288</w:t>
+            </w:r>
+          </w:p>
+        </w:tc>
+      </w:tr>
+      <w:tr>
+        <w:tc>
+          <w:tcPr>
+            <w:tcW w:type="dxa" w:w="3230"/>
+            <w:shd w:val="clear" w:color="auto" w:fill="FFFFFF"/>
+            <w:tcBorders>
+              <w:top w:val="single" w:sz="4" w:space="0" w:color="CCCCCC"/>
+              <w:left w:val="single" w:sz="4" w:space="0" w:color="CCCCCC"/>
+              <w:bottom w:val="single" w:sz="4" w:space="0" w:color="CCCCCC"/>
+              <w:right w:val="single" w:sz="4" w:space="0" w:color="CCCCCC"/>
+            </w:tcBorders>
+          </w:tcPr>
+          <w:p>
+            <w:r>
+              <w:rPr>
+                <w:color w:val="37474F"/>
+                <w:sz w:val="16"/>
+              </w:rPr>
+              <w:t>Longitud (°E)</w:t>
+            </w:r>
+          </w:p>
+        </w:tc>
+        <w:tc>
+          <w:tcPr>
+            <w:tcW w:type="dxa" w:w="3230"/>
+            <w:shd w:val="clear" w:color="auto" w:fill="FFFFFF"/>
+            <w:tcBorders>
+              <w:top w:val="single" w:sz="4" w:space="0" w:color="CCCCCC"/>
+              <w:left w:val="single" w:sz="4" w:space="0" w:color="CCCCCC"/>
+              <w:bottom w:val="single" w:sz="4" w:space="0" w:color="CCCCCC"/>
+              <w:right w:val="single" w:sz="4" w:space="0" w:color="CCCCCC"/>
+            </w:tcBorders>
+          </w:tcPr>
+          <w:p>
+            <w:r>
+              <w:rPr>
+                <w:color w:val="37474F"/>
+                <w:sz w:val="16"/>
+              </w:rPr>
+              <w:t>Colombia: siempre negativo, entre -67° y -82°.</w:t>
+            </w:r>
+          </w:p>
+        </w:tc>
+        <w:tc>
+          <w:tcPr>
+            <w:tcW w:type="dxa" w:w="3230"/>
+            <w:shd w:val="clear" w:color="auto" w:fill="FFFFFF"/>
+            <w:tcBorders>
+              <w:top w:val="single" w:sz="4" w:space="0" w:color="CCCCCC"/>
+              <w:left w:val="single" w:sz="4" w:space="0" w:color="CCCCCC"/>
+              <w:bottom w:val="single" w:sz="4" w:space="0" w:color="CCCCCC"/>
+              <w:right w:val="single" w:sz="4" w:space="0" w:color="CCCCCC"/>
+            </w:tcBorders>
+          </w:tcPr>
+          <w:p>
+            <w:r>
+              <w:rPr>
+                <w:color w:val="37474F"/>
+                <w:sz w:val="16"/>
+              </w:rPr>
+              <w:t>-74.07146</w:t>
+            </w:r>
+          </w:p>
+        </w:tc>
+      </w:tr>
+      <w:tr>
+        <w:tc>
+          <w:tcPr>
+            <w:tcW w:type="dxa" w:w="3230"/>
+            <w:shd w:val="clear" w:color="auto" w:fill="E8F5E9"/>
+            <w:tcBorders>
+              <w:top w:val="single" w:sz="4" w:space="0" w:color="CCCCCC"/>
+              <w:left w:val="single" w:sz="4" w:space="0" w:color="CCCCCC"/>
+              <w:bottom w:val="single" w:sz="4" w:space="0" w:color="CCCCCC"/>
+              <w:right w:val="single" w:sz="4" w:space="0" w:color="CCCCCC"/>
+            </w:tcBorders>
+          </w:tcPr>
+          <w:p>
+            <w:r>
+              <w:rPr>
+                <w:color w:val="37474F"/>
+                <w:sz w:val="16"/>
+              </w:rPr>
+              <w:t>Altitud (m.s.n.m.)</w:t>
+            </w:r>
+          </w:p>
+        </w:tc>
+        <w:tc>
+          <w:tcPr>
+            <w:tcW w:type="dxa" w:w="3230"/>
+            <w:shd w:val="clear" w:color="auto" w:fill="E8F5E9"/>
+            <w:tcBorders>
+              <w:top w:val="single" w:sz="4" w:space="0" w:color="CCCCCC"/>
+              <w:left w:val="single" w:sz="4" w:space="0" w:color="CCCCCC"/>
+              <w:bottom w:val="single" w:sz="4" w:space="0" w:color="CCCCCC"/>
+              <w:right w:val="single" w:sz="4" w:space="0" w:color="CCCCCC"/>
+            </w:tcBorders>
+          </w:tcPr>
+          <w:p>
+            <w:r>
+              <w:rPr>
+                <w:color w:val="37474F"/>
+                <w:sz w:val="16"/>
+              </w:rPr>
+              <w:t>Altura del predio sobre el nivel del mar.</w:t>
+            </w:r>
+          </w:p>
+        </w:tc>
+        <w:tc>
+          <w:tcPr>
+            <w:tcW w:type="dxa" w:w="3230"/>
+            <w:shd w:val="clear" w:color="auto" w:fill="E8F5E9"/>
+            <w:tcBorders>
+              <w:top w:val="single" w:sz="4" w:space="0" w:color="CCCCCC"/>
+              <w:left w:val="single" w:sz="4" w:space="0" w:color="CCCCCC"/>
+              <w:bottom w:val="single" w:sz="4" w:space="0" w:color="CCCCCC"/>
+              <w:right w:val="single" w:sz="4" w:space="0" w:color="CCCCCC"/>
+            </w:tcBorders>
+          </w:tcPr>
+          <w:p>
+            <w:r>
+              <w:rPr>
+                <w:color w:val="37474F"/>
+                <w:sz w:val="16"/>
+              </w:rPr>
+              <w:t>2600</w:t>
+            </w:r>
+          </w:p>
+        </w:tc>
+      </w:tr>
+    </w:tbl>
+    <w:p>
+      <w:pPr>
+        <w:spacing w:after="60"/>
+      </w:pPr>
+    </w:p>
+    <w:tbl>
+      <w:tblPr>
+        <w:tblW w:type="auto" w:w="0"/>
+        <w:jc w:val="left"/>
+        <w:tblLook w:firstColumn="1" w:firstRow="1" w:lastColumn="0" w:lastRow="0" w:noHBand="0" w:noVBand="1" w:val="04A0"/>
+      </w:tblPr>
+      <w:tblGrid>
+        <w:gridCol w:w="9689"/>
+      </w:tblGrid>
+      <w:tr>
+        <w:tc>
+          <w:tcPr>
+            <w:tcW w:type="dxa" w:w="9689"/>
+            <w:shd w:val="clear" w:color="auto" w:fill="E8F5E9"/>
+            <w:tcBorders>
+              <w:top w:val="single" w:sz="4" w:space="0" w:color="1B5E20"/>
+              <w:left w:val="single" w:sz="4" w:space="0" w:color="1B5E20"/>
+              <w:bottom w:val="single" w:sz="4" w:space="0" w:color="1B5E20"/>
+              <w:right w:val="single" w:sz="4" w:space="0" w:color="1B5E20"/>
+            </w:tcBorders>
+          </w:tcPr>
+          <w:p>
+            <w:pPr>
+              <w:spacing w:before="40" w:after="40"/>
+              <w:ind w:left="113"/>
+            </w:pPr>
+            <w:r>
+              <w:rPr>
+                <w:b/>
+                <w:color w:val="1B5E20"/>
+                <w:sz w:val="18"/>
+              </w:rPr>
+              <w:t xml:space="preserve">✔  Cómo confirmar que las coordenadas quedaron activas:  </w:t>
+            </w:r>
+            <w:r>
+              <w:rPr>
+                <w:color w:val="37474F"/>
+                <w:sz w:val="18"/>
+              </w:rPr>
+              <w:t xml:space="preserve"> Al hacer clic en Guardar configuración con coordenadas personalizadas, el mensaje de éxito mostrará: 'Predio: X.XXXXX°, Y.YYYYY°, ZZZ m.s.n.m.' En Página 2 (Recurso Solar) aparecerá un banner verde con el texto 'Usando coordenadas exactas del predio' y los valores ingresados. Las métricas de Latitud/Longitud en esa página mostrarán 5 decimales.</w:t>
+            </w:r>
+          </w:p>
+        </w:tc>
+      </w:tr>
+    </w:tbl>
+    <w:p>
+      <w:pPr>
+        <w:spacing w:after="40"/>
+      </w:pPr>
+    </w:p>
+    <w:tbl>
+      <w:tblPr>
+        <w:tblW w:type="auto" w:w="0"/>
+        <w:jc w:val="left"/>
+        <w:tblLook w:firstColumn="1" w:firstRow="1" w:lastColumn="0" w:lastRow="0" w:noHBand="0" w:noVBand="1" w:val="04A0"/>
+      </w:tblPr>
+      <w:tblGrid>
+        <w:gridCol w:w="9689"/>
+      </w:tblGrid>
+      <w:tr>
+        <w:tc>
+          <w:tcPr>
+            <w:tcW w:type="dxa" w:w="9689"/>
+            <w:shd w:val="clear" w:color="auto" w:fill="E3F2FD"/>
+            <w:tcBorders>
+              <w:top w:val="single" w:sz="4" w:space="0" w:color="0D47A1"/>
+              <w:left w:val="single" w:sz="4" w:space="0" w:color="0D47A1"/>
+              <w:bottom w:val="single" w:sz="4" w:space="0" w:color="0D47A1"/>
+              <w:right w:val="single" w:sz="4" w:space="0" w:color="0D47A1"/>
+            </w:tcBorders>
+          </w:tcPr>
+          <w:p>
+            <w:pPr>
+              <w:spacing w:before="40" w:after="40"/>
+              <w:ind w:left="113"/>
+            </w:pPr>
+            <w:r>
+              <w:rPr>
+                <w:b/>
+                <w:color w:val="0D47A1"/>
+                <w:sz w:val="18"/>
+              </w:rPr>
+              <w:t xml:space="preserve">🔄  Propagación automática a otras páginas:  </w:t>
+            </w:r>
+            <w:r>
+              <w:rPr>
+                <w:color w:val="37474F"/>
+                <w:sz w:val="18"/>
+              </w:rPr>
+              <w:t xml:space="preserve"> Una vez guardadas en Página 1, las coordenadas exactas del predio se propagan automáticamente a:</w:t>
+              <w:br/>
+              <w:t xml:space="preserve">  • Página 2 (Recurso Solar) — PVGIS descarga el TMY del punto exacto.</w:t>
+              <w:br/>
+              <w:t xml:space="preserve">  • Motor Óptico (Pág. 5b) — hereda el TMY de Página 2, no necesita ajuste.</w:t>
+              <w:br/>
+              <w:t xml:space="preserve">  • Vista 3D (Pág. 9) — el mapa Mapbox y el diagrama solar pvlib usan las coordenadas del predio, no el centro de la ciudad.</w:t>
+            </w:r>
+          </w:p>
+        </w:tc>
+      </w:tr>
+    </w:tbl>
+    <w:p>
+      <w:pPr>
+        <w:spacing w:after="40"/>
+      </w:pPr>
+    </w:p>
     <w:p>
       <w:pPr>
         <w:spacing w:before="20" w:after="40"/>
@@ -2438,6 +2866,56 @@
         </w:rPr>
         <w:t>Hacer clic en  Calcular Recurso Solar.  Esperar 30-90 segundos.</w:t>
       </w:r>
+    </w:p>
+    <w:tbl>
+      <w:tblPr>
+        <w:tblW w:type="auto" w:w="0"/>
+        <w:jc w:val="left"/>
+        <w:tblLook w:firstColumn="1" w:firstRow="1" w:lastColumn="0" w:lastRow="0" w:noHBand="0" w:noVBand="1" w:val="04A0"/>
+      </w:tblPr>
+      <w:tblGrid>
+        <w:gridCol w:w="9689"/>
+      </w:tblGrid>
+      <w:tr>
+        <w:tc>
+          <w:tcPr>
+            <w:tcW w:type="dxa" w:w="9689"/>
+            <w:shd w:val="clear" w:color="auto" w:fill="E3F2FD"/>
+            <w:tcBorders>
+              <w:top w:val="single" w:sz="4" w:space="0" w:color="0D47A1"/>
+              <w:left w:val="single" w:sz="4" w:space="0" w:color="0D47A1"/>
+              <w:bottom w:val="single" w:sz="4" w:space="0" w:color="0D47A1"/>
+              <w:right w:val="single" w:sz="4" w:space="0" w:color="0D47A1"/>
+            </w:tcBorders>
+          </w:tcPr>
+          <w:p>
+            <w:pPr>
+              <w:spacing w:before="40" w:after="40"/>
+              <w:ind w:left="113"/>
+            </w:pPr>
+            <w:r>
+              <w:rPr>
+                <w:b/>
+                <w:color w:val="0D47A1"/>
+                <w:sz w:val="18"/>
+              </w:rPr>
+              <w:t xml:space="preserve">ℹ    </w:t>
+            </w:r>
+            <w:r>
+              <w:rPr>
+                <w:color w:val="37474F"/>
+                <w:sz w:val="18"/>
+              </w:rPr>
+              <w:t>Si ingresó coordenadas exactas en Página 1, esta página mostrará un banner verde con el texto 'Usando coordenadas exactas del predio' y los valores precisos de latitud/longitud. Si el banner NO aparece y las métricas muestran los valores genéricos de la ciudad, regresar a Página 1, abrir el expander de coordenadas, ingresar los valores y hacer clic en Guardar configuración.</w:t>
+            </w:r>
+          </w:p>
+        </w:tc>
+      </w:tr>
+    </w:tbl>
+    <w:p>
+      <w:pPr>
+        <w:spacing w:after="40"/>
+      </w:pPr>
     </w:p>
     <w:tbl>
       <w:tblPr>
@@ -11060,6 +11538,136 @@
                 <w:color w:val="37474F"/>
                 <w:sz w:val="16"/>
               </w:rPr>
+              <w:t>Página 2 muestra coordenadas genéricas de la ciudad aunque se ingresaron coordenadas del predio</w:t>
+            </w:r>
+          </w:p>
+        </w:tc>
+        <w:tc>
+          <w:tcPr>
+            <w:tcW w:type="dxa" w:w="3230"/>
+            <w:shd w:val="clear" w:color="auto" w:fill="E8F5E9"/>
+            <w:tcBorders>
+              <w:top w:val="single" w:sz="4" w:space="0" w:color="CCCCCC"/>
+              <w:left w:val="single" w:sz="4" w:space="0" w:color="CCCCCC"/>
+              <w:bottom w:val="single" w:sz="4" w:space="0" w:color="CCCCCC"/>
+              <w:right w:val="single" w:sz="4" w:space="0" w:color="CCCCCC"/>
+            </w:tcBorders>
+          </w:tcPr>
+          <w:p>
+            <w:r>
+              <w:rPr>
+                <w:color w:val="37474F"/>
+                <w:sz w:val="16"/>
+              </w:rPr>
+              <w:t>Las coordenadas se ingresaron en el expander pero no se hizo clic en Guardar configuración, o la sesión se reinició</w:t>
+            </w:r>
+          </w:p>
+        </w:tc>
+        <w:tc>
+          <w:tcPr>
+            <w:tcW w:type="dxa" w:w="3230"/>
+            <w:shd w:val="clear" w:color="auto" w:fill="E8F5E9"/>
+            <w:tcBorders>
+              <w:top w:val="single" w:sz="4" w:space="0" w:color="CCCCCC"/>
+              <w:left w:val="single" w:sz="4" w:space="0" w:color="CCCCCC"/>
+              <w:bottom w:val="single" w:sz="4" w:space="0" w:color="CCCCCC"/>
+              <w:right w:val="single" w:sz="4" w:space="0" w:color="CCCCCC"/>
+            </w:tcBorders>
+          </w:tcPr>
+          <w:p>
+            <w:r>
+              <w:rPr>
+                <w:color w:val="37474F"/>
+                <w:sz w:val="16"/>
+              </w:rPr>
+              <w:t>Regresar a Página 1 → abrir expander '📍 Coordenadas exactas del predio' → verificar los valores → hacer clic en Guardar configuración. El banner verde en Página 2 confirma que las coordenadas del predio están activas.</w:t>
+            </w:r>
+          </w:p>
+        </w:tc>
+      </w:tr>
+      <w:tr>
+        <w:tc>
+          <w:tcPr>
+            <w:tcW w:type="dxa" w:w="3230"/>
+            <w:shd w:val="clear" w:color="auto" w:fill="FFFFFF"/>
+            <w:tcBorders>
+              <w:top w:val="single" w:sz="4" w:space="0" w:color="CCCCCC"/>
+              <w:left w:val="single" w:sz="4" w:space="0" w:color="CCCCCC"/>
+              <w:bottom w:val="single" w:sz="4" w:space="0" w:color="CCCCCC"/>
+              <w:right w:val="single" w:sz="4" w:space="0" w:color="CCCCCC"/>
+            </w:tcBorders>
+          </w:tcPr>
+          <w:p>
+            <w:r>
+              <w:rPr>
+                <w:color w:val="37474F"/>
+                <w:sz w:val="16"/>
+              </w:rPr>
+              <w:t>Vista 3D centra el mapa en el centro de la ciudad, no en el predio</w:t>
+            </w:r>
+          </w:p>
+        </w:tc>
+        <w:tc>
+          <w:tcPr>
+            <w:tcW w:type="dxa" w:w="3230"/>
+            <w:shd w:val="clear" w:color="auto" w:fill="FFFFFF"/>
+            <w:tcBorders>
+              <w:top w:val="single" w:sz="4" w:space="0" w:color="CCCCCC"/>
+              <w:left w:val="single" w:sz="4" w:space="0" w:color="CCCCCC"/>
+              <w:bottom w:val="single" w:sz="4" w:space="0" w:color="CCCCCC"/>
+              <w:right w:val="single" w:sz="4" w:space="0" w:color="CCCCCC"/>
+            </w:tcBorders>
+          </w:tcPr>
+          <w:p>
+            <w:r>
+              <w:rPr>
+                <w:color w:val="37474F"/>
+                <w:sz w:val="16"/>
+              </w:rPr>
+              <w:t>Misma causa: coordenadas del predio no guardadas en sesión</w:t>
+            </w:r>
+          </w:p>
+        </w:tc>
+        <w:tc>
+          <w:tcPr>
+            <w:tcW w:type="dxa" w:w="3230"/>
+            <w:shd w:val="clear" w:color="auto" w:fill="FFFFFF"/>
+            <w:tcBorders>
+              <w:top w:val="single" w:sz="4" w:space="0" w:color="CCCCCC"/>
+              <w:left w:val="single" w:sz="4" w:space="0" w:color="CCCCCC"/>
+              <w:bottom w:val="single" w:sz="4" w:space="0" w:color="CCCCCC"/>
+              <w:right w:val="single" w:sz="4" w:space="0" w:color="CCCCCC"/>
+            </w:tcBorders>
+          </w:tcPr>
+          <w:p>
+            <w:r>
+              <w:rPr>
+                <w:color w:val="37474F"/>
+                <w:sz w:val="16"/>
+              </w:rPr>
+              <w:t>Mismo procedimiento: Página 1 → expander coordenadas → Guardar configuración. Vista 3D tomará las coordenadas del predio automáticamente en la siguiente carga.</w:t>
+            </w:r>
+          </w:p>
+        </w:tc>
+      </w:tr>
+      <w:tr>
+        <w:tc>
+          <w:tcPr>
+            <w:tcW w:type="dxa" w:w="3230"/>
+            <w:shd w:val="clear" w:color="auto" w:fill="E8F5E9"/>
+            <w:tcBorders>
+              <w:top w:val="single" w:sz="4" w:space="0" w:color="CCCCCC"/>
+              <w:left w:val="single" w:sz="4" w:space="0" w:color="CCCCCC"/>
+              <w:bottom w:val="single" w:sz="4" w:space="0" w:color="CCCCCC"/>
+              <w:right w:val="single" w:sz="4" w:space="0" w:color="CCCCCC"/>
+            </w:tcBorders>
+          </w:tcPr>
+          <w:p>
+            <w:r>
+              <w:rPr>
+                <w:color w:val="37474F"/>
+                <w:sz w:val="16"/>
+              </w:rPr>
               <w:t>🔋 Página 11 — 'Catálogo no encontrado' o dropdown vacío</w:t>
             </w:r>
           </w:p>
@@ -11497,7 +12105,7 @@
           <w:color w:val="37474F"/>
           <w:sz w:val="18"/>
         </w:rPr>
-        <w:t>Ciudad correcta, tarifa eléctrica real, área o consumo correctamente ingresado y guardado.</w:t>
+        <w:t>Ciudad correcta, tarifa eléctrica real, área o consumo correctamente ingresado y guardado. Si el predio tiene coordenadas GPS distintas al centro de la ciudad: abrir el expander '📍 Coordenadas exactas del predio', ingresar Latitud, Longitud y Altitud, y hacer clic en Guardar configuración. Verificar que el mensaje de éxito muestre 'Predio: X.XXXXX°, Y.YYYYY°'.</w:t>
       </w:r>
     </w:p>
     <w:p>
@@ -11526,7 +12134,7 @@
           <w:color w:val="37474F"/>
           <w:sz w:val="18"/>
         </w:rPr>
-        <w:t>Azimuth y tilt verificados para la orientación real. Recurso Solar calculado sin errores de PVGIS.</w:t>
+        <w:t>Azimuth y tilt verificados para la orientación real. Recurso Solar calculado sin errores de PVGIS. Si se ingresaron coordenadas del predio: verificar que el banner verde 'Usando coordenadas exactas del predio' aparece antes de hacer clic en Descargar TMY.</w:t>
       </w:r>
     </w:p>
     <w:p>

</xml_diff>